<commit_message>
fix: remove horizontal lines from PO bléph sup template
</commit_message>
<xml_diff>
--- a/public/documents/PO bléph sup.docx
+++ b/public/documents/PO bléph sup.docx
@@ -52,8 +52,8 @@
         <w:tblW w:w="10690" w:type="dxa"/>
         <w:tblInd w:w="355" w:type="dxa"/>
         <w:tblBorders>
-          <w:bottom w:val="single" w:color="auto" w:sz="4" w:space="0"/>
-          <w:insideV w:val="single" w:color="auto" w:sz="4" w:space="0"/>
+          <w:bottom w:val="none" w:color="auto" w:sz="4" w:space="0"/>
+          <w:insideV w:val="none" w:color="auto" w:sz="4" w:space="0"/>
         </w:tblBorders>
         <w:tblLayout w:type="fixed"/>
         <w:tblCellMar>
@@ -78,7 +78,7 @@
           <w:tcPr>
             <w:gridSpan w:val="3"/>
             <w:tcBorders>
-              <w:bottom w:val="single" w:color="auto" w:sz="4" w:space="0"/>
+              <w:bottom w:val="none" w:color="auto" w:sz="4" w:space="0"/>
             </w:tcBorders>
             <w:tcW w:w="5103" w:type="dxa"/>
             <w:textDirection w:val="lrTb"/>
@@ -496,7 +496,7 @@
           <w:tcPr>
             <w:gridSpan w:val="3"/>
             <w:tcBorders>
-              <w:bottom w:val="single" w:color="auto" w:sz="4" w:space="0"/>
+              <w:bottom w:val="none" w:color="auto" w:sz="4" w:space="0"/>
             </w:tcBorders>
             <w:tcW w:w="5587" w:type="dxa"/>
             <w:textDirection w:val="lrTb"/>
@@ -676,7 +676,7 @@
           <w:tcPr>
             <w:gridSpan w:val="6"/>
             <w:tcBorders>
-              <w:top w:val="single" w:color="auto" w:sz="4" w:space="0"/>
+              <w:top w:val="none" w:color="auto" w:sz="4" w:space="0"/>
               <w:bottom w:val="none" w:color="000000" w:sz="4" w:space="0"/>
             </w:tcBorders>
             <w:tcW w:w="10690" w:type="dxa"/>
@@ -1844,7 +1844,7 @@
           <w:p>
             <w:pPr>
               <w:pBdr>
-                <w:top w:val="single" w:color="000000" w:sz="4" w:space="0"/>
+                <w:top w:val="none" w:color="000000" w:sz="4" w:space="0"/>
                 <w:left w:val="none" w:color="000000" w:sz="4" w:space="0"/>
                 <w:bottom w:val="none" w:color="000000" w:sz="4" w:space="0"/>
                 <w:right w:val="none" w:color="000000" w:sz="4" w:space="0"/>
@@ -1882,7 +1882,7 @@
           <w:p>
             <w:pPr>
               <w:pBdr>
-                <w:top w:val="single" w:color="000000" w:sz="4" w:space="0"/>
+                <w:top w:val="none" w:color="000000" w:sz="4" w:space="0"/>
                 <w:left w:val="none" w:color="000000" w:sz="4" w:space="0"/>
                 <w:bottom w:val="none" w:color="000000" w:sz="4" w:space="0"/>
                 <w:right w:val="none" w:color="000000" w:sz="4" w:space="0"/>
@@ -1926,7 +1926,7 @@
           <w:p>
             <w:pPr>
               <w:pBdr>
-                <w:top w:val="single" w:color="000000" w:sz="4" w:space="0"/>
+                <w:top w:val="none" w:color="000000" w:sz="4" w:space="0"/>
                 <w:left w:val="none" w:color="000000" w:sz="4" w:space="0"/>
                 <w:bottom w:val="none" w:color="000000" w:sz="4" w:space="0"/>
                 <w:right w:val="none" w:color="000000" w:sz="4" w:space="0"/>
@@ -2019,7 +2019,7 @@
           <w:p>
             <w:pPr>
               <w:pBdr>
-                <w:top w:val="single" w:color="000000" w:sz="4" w:space="0"/>
+                <w:top w:val="none" w:color="000000" w:sz="4" w:space="0"/>
                 <w:left w:val="none" w:color="000000" w:sz="4" w:space="0"/>
                 <w:bottom w:val="none" w:color="000000" w:sz="4" w:space="0"/>
                 <w:right w:val="none" w:color="000000" w:sz="4" w:space="0"/>
@@ -2059,7 +2059,7 @@
           <w:p>
             <w:pPr>
               <w:pBdr>
-                <w:top w:val="single" w:color="000000" w:sz="4" w:space="0"/>
+                <w:top w:val="none" w:color="000000" w:sz="4" w:space="0"/>
                 <w:left w:val="none" w:color="000000" w:sz="4" w:space="0"/>
                 <w:bottom w:val="none" w:color="000000" w:sz="4" w:space="0"/>
                 <w:right w:val="none" w:color="000000" w:sz="4" w:space="0"/>
@@ -2174,7 +2174,7 @@
             <w:pPr>
               <w:pStyle w:val="886"/>
               <w:pBdr>
-                <w:top w:val="single" w:color="000000" w:sz="4" w:space="0"/>
+                <w:top w:val="none" w:color="000000" w:sz="4" w:space="0"/>
                 <w:left w:val="none" w:color="000000" w:sz="4" w:space="0"/>
                 <w:bottom w:val="none" w:color="000000" w:sz="4" w:space="0"/>
                 <w:right w:val="none" w:color="000000" w:sz="4" w:space="0"/>
@@ -2235,7 +2235,7 @@
           <w:tcPr>
             <w:gridSpan w:val="6"/>
             <w:tcBorders>
-              <w:bottom w:val="single" w:color="auto" w:sz="4" w:space="0"/>
+              <w:bottom w:val="none" w:color="auto" w:sz="4" w:space="0"/>
             </w:tcBorders>
             <w:tcW w:w="10690" w:type="dxa"/>
             <w:textDirection w:val="lrTb"/>

</xml_diff>

<commit_message>
fix: remove unnecessary paragraph top borders from PO bléph sup template
</commit_message>
<xml_diff>
--- a/public/documents/PO bléph sup.docx
+++ b/public/documents/PO bléph sup.docx
@@ -52,8 +52,8 @@
         <w:tblW w:w="10690" w:type="dxa"/>
         <w:tblInd w:w="355" w:type="dxa"/>
         <w:tblBorders>
-          <w:bottom w:val="none" w:color="auto" w:sz="4" w:space="0"/>
-          <w:insideV w:val="none" w:color="auto" w:sz="4" w:space="0"/>
+          <w:bottom w:val="single" w:color="auto" w:sz="4" w:space="0"/>
+          <w:insideV w:val="single" w:color="auto" w:sz="4" w:space="0"/>
         </w:tblBorders>
         <w:tblLayout w:type="fixed"/>
         <w:tblCellMar>
@@ -78,7 +78,7 @@
           <w:tcPr>
             <w:gridSpan w:val="3"/>
             <w:tcBorders>
-              <w:bottom w:val="none" w:color="auto" w:sz="4" w:space="0"/>
+              <w:bottom w:val="single" w:color="auto" w:sz="4" w:space="0"/>
             </w:tcBorders>
             <w:tcW w:w="5103" w:type="dxa"/>
             <w:textDirection w:val="lrTb"/>
@@ -496,7 +496,7 @@
           <w:tcPr>
             <w:gridSpan w:val="3"/>
             <w:tcBorders>
-              <w:bottom w:val="none" w:color="auto" w:sz="4" w:space="0"/>
+              <w:bottom w:val="single" w:color="auto" w:sz="4" w:space="0"/>
             </w:tcBorders>
             <w:tcW w:w="5587" w:type="dxa"/>
             <w:textDirection w:val="lrTb"/>
@@ -676,7 +676,7 @@
           <w:tcPr>
             <w:gridSpan w:val="6"/>
             <w:tcBorders>
-              <w:top w:val="none" w:color="auto" w:sz="4" w:space="0"/>
+              <w:top w:val="single" w:color="auto" w:sz="4" w:space="0"/>
               <w:bottom w:val="none" w:color="000000" w:sz="4" w:space="0"/>
             </w:tcBorders>
             <w:tcW w:w="10690" w:type="dxa"/>
@@ -1843,13 +1843,6 @@
           </w:tcPr>
           <w:p>
             <w:pPr>
-              <w:pBdr>
-                <w:top w:val="none" w:color="000000" w:sz="4" w:space="0"/>
-                <w:left w:val="none" w:color="000000" w:sz="4" w:space="0"/>
-                <w:bottom w:val="none" w:color="000000" w:sz="4" w:space="0"/>
-                <w:right w:val="none" w:color="000000" w:sz="4" w:space="0"/>
-                <w:between w:val="none" w:color="000000" w:sz="4" w:space="0"/>
-              </w:pBdr>
               <w:spacing/>
               <w:ind w:left="-71"/>
               <w:rPr>
@@ -1881,13 +1874,6 @@
           </w:p>
           <w:p>
             <w:pPr>
-              <w:pBdr>
-                <w:top w:val="none" w:color="000000" w:sz="4" w:space="0"/>
-                <w:left w:val="none" w:color="000000" w:sz="4" w:space="0"/>
-                <w:bottom w:val="none" w:color="000000" w:sz="4" w:space="0"/>
-                <w:right w:val="none" w:color="000000" w:sz="4" w:space="0"/>
-                <w:between w:val="none" w:color="000000" w:sz="4" w:space="0"/>
-              </w:pBdr>
               <w:spacing/>
               <w:ind w:left="-71"/>
               <w:rPr>
@@ -1925,13 +1911,6 @@
           </w:p>
           <w:p>
             <w:pPr>
-              <w:pBdr>
-                <w:top w:val="none" w:color="000000" w:sz="4" w:space="0"/>
-                <w:left w:val="none" w:color="000000" w:sz="4" w:space="0"/>
-                <w:bottom w:val="none" w:color="000000" w:sz="4" w:space="0"/>
-                <w:right w:val="none" w:color="000000" w:sz="4" w:space="0"/>
-                <w:between w:val="none" w:color="000000" w:sz="4" w:space="0"/>
-              </w:pBdr>
               <w:spacing/>
               <w:ind w:left="-71"/>
               <w:rPr>
@@ -2018,13 +1997,6 @@
           </w:p>
           <w:p>
             <w:pPr>
-              <w:pBdr>
-                <w:top w:val="none" w:color="000000" w:sz="4" w:space="0"/>
-                <w:left w:val="none" w:color="000000" w:sz="4" w:space="0"/>
-                <w:bottom w:val="none" w:color="000000" w:sz="4" w:space="0"/>
-                <w:right w:val="none" w:color="000000" w:sz="4" w:space="0"/>
-                <w:between w:val="none" w:color="000000" w:sz="4" w:space="0"/>
-              </w:pBdr>
               <w:spacing/>
               <w:ind w:left="-71"/>
               <w:rPr>
@@ -2058,13 +2030,6 @@
           </w:p>
           <w:p>
             <w:pPr>
-              <w:pBdr>
-                <w:top w:val="none" w:color="000000" w:sz="4" w:space="0"/>
-                <w:left w:val="none" w:color="000000" w:sz="4" w:space="0"/>
-                <w:bottom w:val="none" w:color="000000" w:sz="4" w:space="0"/>
-                <w:right w:val="none" w:color="000000" w:sz="4" w:space="0"/>
-                <w:between w:val="none" w:color="000000" w:sz="4" w:space="0"/>
-              </w:pBdr>
               <w:spacing/>
               <w:ind w:left="-71"/>
               <w:rPr>
@@ -2173,13 +2138,6 @@
           <w:p>
             <w:pPr>
               <w:pStyle w:val="886"/>
-              <w:pBdr>
-                <w:top w:val="none" w:color="000000" w:sz="4" w:space="0"/>
-                <w:left w:val="none" w:color="000000" w:sz="4" w:space="0"/>
-                <w:bottom w:val="none" w:color="000000" w:sz="4" w:space="0"/>
-                <w:right w:val="none" w:color="000000" w:sz="4" w:space="0"/>
-                <w:between w:val="none" w:color="000000" w:sz="4" w:space="0"/>
-              </w:pBdr>
               <w:tabs>
                 <w:tab w:val="clear" w:leader="none" w:pos="4536"/>
                 <w:tab w:val="clear" w:leader="none" w:pos="9072"/>
@@ -2235,7 +2193,7 @@
           <w:tcPr>
             <w:gridSpan w:val="6"/>
             <w:tcBorders>
-              <w:bottom w:val="none" w:color="auto" w:sz="4" w:space="0"/>
+              <w:bottom w:val="single" w:color="auto" w:sz="4" w:space="0"/>
             </w:tcBorders>
             <w:tcW w:w="10690" w:type="dxa"/>
             <w:textDirection w:val="lrTb"/>

</xml_diff>

<commit_message>
fix: keep one separator line below Assistante in PO bléph sup template
</commit_message>
<xml_diff>
--- a/public/documents/PO bléph sup.docx
+++ b/public/documents/PO bléph sup.docx
@@ -1843,6 +1843,13 @@
           </w:tcPr>
           <w:p>
             <w:pPr>
+              <w:pBdr>
+                <w:top w:val="single" w:color="000000" w:sz="4" w:space="0"/>
+                <w:left w:val="none" w:color="000000" w:sz="4" w:space="0"/>
+                <w:bottom w:val="none" w:color="000000" w:sz="4" w:space="0"/>
+                <w:right w:val="none" w:color="000000" w:sz="4" w:space="0"/>
+                <w:between w:val="none" w:color="000000" w:sz="4" w:space="0"/>
+              </w:pBdr>
               <w:spacing/>
               <w:ind w:left="-71"/>
               <w:rPr>

</xml_diff>